<commit_message>
EchoSensei V4 - Checkpoint4
</commit_message>
<xml_diff>
--- a/echosensei/EchoSensei_Migration_Guide.docx
+++ b/echosensei/EchoSensei_Migration_Guide.docx
@@ -19,7 +19,7 @@
         <w:t xml:space="preserve">Conversation ID (Antigravity): </w:t>
       </w:r>
       <w:r>
-        <w:t>6e645dc5-9d0c-4e0a-9ef3-9ea31b4add2c</w:t>
+        <w:t>63039053-dd38-4e58-837a-a2e9759f0e94</w:t>
       </w:r>
     </w:p>
     <w:p>
@@ -32,7 +32,7 @@
     </w:p>
     <w:p>
       <w:r>
-        <w:t>The interface has been redesigned to follow a "Vibrant Cyber-Clinical" aesthetic. Key design tokens include:</w:t>
+        <w:t>The interface follows a "Vibrant Cyber-Clinical" aesthetic with heavy animations. Key design tokens include:</w:t>
       </w:r>
     </w:p>
     <w:p>
@@ -40,7 +40,7 @@
         <w:pStyle w:val="ListBullet"/>
       </w:pPr>
       <w:r>
-        <w:t>Main UI: Colorful drifting orbs in Blue and Pink shades over a deep dark indigo background (#080a16).</w:t>
+        <w:t>Main UI: Colorful drifting orbs + particle field over deep dark indigo (#060815).</w:t>
       </w:r>
     </w:p>
     <w:p>
@@ -48,7 +48,7 @@
         <w:pStyle w:val="ListBullet"/>
       </w:pPr>
       <w:r>
-        <w:t>Loading Page: Pure Black (#000000) with a canvas-based EKG heartbeat loader.</w:t>
+        <w:t>Loading Page: Pure Black (#000000) with canvas-based EKG heartbeat + boot sequence.</w:t>
       </w:r>
     </w:p>
     <w:p>
@@ -56,7 +56,7 @@
         <w:pStyle w:val="ListBullet"/>
       </w:pPr>
       <w:r>
-        <w:t>Layout: Top Navbar with tabbed navigation (Dashboard, Sensei AI, Timeline, About).</w:t>
+        <w:t>Layout: Top Navbar with 5 tabs (Dashboard, Sensei AI, History, Analytics, About).</w:t>
       </w:r>
     </w:p>
     <w:p>
@@ -64,7 +64,47 @@
         <w:pStyle w:val="ListBullet"/>
       </w:pPr>
       <w:r>
-        <w:t>Typography: Outfit (Headers) and Inter (Body) for high-end legibility.</w:t>
+        <w:t>Typography: Outfit (Headers) and Inter (Body) for premium legibility.</w:t>
+      </w:r>
+    </w:p>
+    <w:p>
+      <w:pPr>
+        <w:pStyle w:val="ListBullet"/>
+      </w:pPr>
+      <w:r>
+        <w:t>Domain switching: Healthcare / Finance / Survey / General with animated chips.</w:t>
+      </w:r>
+    </w:p>
+    <w:p>
+      <w:pPr>
+        <w:pStyle w:val="ListBullet"/>
+      </w:pPr>
+      <w:r>
+        <w:t>Text + Voice input: Dual input modes on dashboard and chat pages.</w:t>
+      </w:r>
+    </w:p>
+    <w:p>
+      <w:pPr>
+        <w:pStyle w:val="ListBullet"/>
+      </w:pPr>
+      <w:r>
+        <w:t>Editable Review: Click Edit to modify extracted entities inline.</w:t>
+      </w:r>
+    </w:p>
+    <w:p>
+      <w:pPr>
+        <w:pStyle w:val="ListBullet"/>
+      </w:pPr>
+      <w:r>
+        <w:t>Session History: Searchable past sessions with domain badges and time-ago labels.</w:t>
+      </w:r>
+    </w:p>
+    <w:p>
+      <w:pPr>
+        <w:pStyle w:val="ListBullet"/>
+      </w:pPr>
+      <w:r>
+        <w:t>Analytics: Donut chart (domains) + Bar chart (languages) + reasoning timeline.</w:t>
       </w:r>
     </w:p>
     <w:p>
@@ -80,7 +120,7 @@
         <w:pStyle w:val="ListBullet"/>
       </w:pPr>
       <w:r>
-        <w:t>Multilingual Voice ASR: Integrated MediaRecorder and IndicConformer for high-accuracy speech-to-text (Hindi, Tamil, Kannada, English).</w:t>
+        <w:t>Multilingual ASR: IndicConformer / Whisper fallback (Hindi, Tamil, Kannada, English, code-mixed).</w:t>
       </w:r>
     </w:p>
     <w:p>
@@ -88,7 +128,7 @@
         <w:pStyle w:val="ListBullet"/>
       </w:pPr>
       <w:r>
-        <w:t>Sensei LLM Pipeline: Single-pass clinical extraction (Akinator-style) with follow-up reasoning.</w:t>
+        <w:t>Multi-Domain LLM: Dynamic prompt templates for Healthcare, Finance, Survey, General.</w:t>
       </w:r>
     </w:p>
     <w:p>
@@ -96,7 +136,7 @@
         <w:pStyle w:val="ListBullet"/>
       </w:pPr>
       <w:r>
-        <w:t>AI Translation Layer: Automatically generates English translations in real-time for non-English AI responses (displayed in brackets).</w:t>
+        <w:t>Editable Review Interface: Human validation &amp; correction of extracted data.</w:t>
       </w:r>
     </w:p>
     <w:p>
@@ -104,7 +144,7 @@
         <w:pStyle w:val="ListBullet"/>
       </w:pPr>
       <w:r>
-        <w:t>Sensei Voice (TTS): Integrated Web Speech API for audible AI responses in a "Sensei" persona (Deep, David/Daniel voice types).</w:t>
+        <w:t>Session Management: Create, list, search, delete sessions with full history.</w:t>
       </w:r>
     </w:p>
     <w:p>
@@ -112,7 +152,31 @@
         <w:pStyle w:val="ListBullet"/>
       </w:pPr>
       <w:r>
-        <w:t>Medical Reporting: On-the-fly entity extraction into a clinical report grid with PDF export.</w:t>
+        <w:t>Longitudinal Dashboard: Analytics across all sessions with charts.</w:t>
+      </w:r>
+    </w:p>
+    <w:p>
+      <w:pPr>
+        <w:pStyle w:val="ListBullet"/>
+      </w:pPr>
+      <w:r>
+        <w:t>Text + Voice Input: Dual-mode input on dashboard and chat pages.</w:t>
+      </w:r>
+    </w:p>
+    <w:p>
+      <w:pPr>
+        <w:pStyle w:val="ListBullet"/>
+      </w:pPr>
+      <w:r>
+        <w:t>TTS: Web Speech API for Sensei voice responses.</w:t>
+      </w:r>
+    </w:p>
+    <w:p>
+      <w:pPr>
+        <w:pStyle w:val="ListBullet"/>
+      </w:pPr>
+      <w:r>
+        <w:t>PDF Export: Domain-aware report generation.</w:t>
       </w:r>
     </w:p>
     <w:p>
@@ -133,7 +197,7 @@
     </w:p>
     <w:p>
       <w:r>
-        <w:t>The entire final codebase is packaged in: EchoSensei_Vibrant_Final.zip. Download and extract this folder into your new Antigravity / Gemini scratch directory.</w:t>
+        <w:t>Copy the entire echosensei directory to your new workspace.</w:t>
       </w:r>
     </w:p>
     <w:p>
@@ -146,7 +210,7 @@
     </w:p>
     <w:p>
       <w:r>
-        <w:t>Ensure the following dependencies are installed (run in terminal):</w:t>
+        <w:t>Install dependencies:</w:t>
       </w:r>
     </w:p>
     <w:p>
@@ -155,7 +219,7 @@
           <w:rFonts w:ascii="Courier New" w:hAnsi="Courier New"/>
           <w:sz w:val="20"/>
         </w:rPr>
-        <w:t>pip install flask flask-cors deep-translator groq python-docx</w:t>
+        <w:t>pip install -r requirements.txt</w:t>
       </w:r>
     </w:p>
     <w:p>
@@ -163,12 +227,12 @@
         <w:pStyle w:val="Heading2"/>
       </w:pPr>
       <w:r>
-        <w:t>Step 3: Running the App</w:t>
+        <w:t>Step 3: Set GROQ_API_KEY</w:t>
       </w:r>
     </w:p>
     <w:p>
       <w:r>
-        <w:t>Execute the server script to launch the local clinical environment:</w:t>
+        <w:t>Set your Groq API key as an environment variable:</w:t>
       </w:r>
     </w:p>
     <w:p>
@@ -177,17 +241,25 @@
           <w:rFonts w:ascii="Courier New" w:hAnsi="Courier New"/>
           <w:sz w:val="20"/>
         </w:rPr>
+        <w:t>set GROQ_API_KEY=your_key_here</w:t>
+      </w:r>
+    </w:p>
+    <w:p>
+      <w:pPr>
+        <w:pStyle w:val="Heading2"/>
+      </w:pPr>
+      <w:r>
+        <w:t>Step 4: Run</w:t>
+      </w:r>
+    </w:p>
+    <w:p>
+      <w:r>
         <w:t>python server.py</w:t>
       </w:r>
     </w:p>
     <w:p>
       <w:r>
-        <w:t>Then open http://localhost:5000 in your browser.</w:t>
-      </w:r>
-    </w:p>
-    <w:p>
-      <w:r>
-        <w:br/>
+        <w:t>Then open http://localhost:5000</w:t>
       </w:r>
     </w:p>
     <w:p>
@@ -195,7 +267,7 @@
         <w:jc w:val="right"/>
       </w:pPr>
       <w:r>
-        <w:t>Handed over by Antigravity AI — Neural Medical Intelligence Pipeline.</w:t>
+        <w:t>Generated by EchoSensei AI — Conversational Intelligence Platform.</w:t>
       </w:r>
     </w:p>
     <w:sectPr>

</xml_diff>